<commit_message>
Fix: background refresh loop was overwriting fresh TM push price
The _refresh_loop ran every 30s and overwrote _tm_data["price"] with
the stale cache file price, undoing any /tm/push updates. Now it only
falls back to cache when TM push data is older than 180 seconds.

Co-Authored-By: Claude Opus 4.6 (1M context) <noreply@anthropic.com>
</commit_message>
<xml_diff>
--- a/TrueMarkets_Technical_Doc_NEW.docx
+++ b/TrueMarkets_Technical_Doc_NEW.docx
@@ -122,7 +122,16 @@
         <w:spacing w:after="120"/>
       </w:pPr>
       <w:r>
-        <w:t>Our ML model achieves 67.4% directional accuracy on 359 out-of-sample test days (April 2025 – April 2026), using 30 Boruta-selected features from 216 engineered on-chain and price-derived features.</w:t>
+        <w:t xml:space="preserve">Our ML model achieves 67.4% directional accuracy on 359 out-of-sample test days (April 2025 – April 2026), using 30 </w:t>
+      </w:r>
+      <w:r>
+        <w:rPr>
+          <w:highlight w:val="yellow"/>
+        </w:rPr>
+        <w:t>Boruta</w:t>
+      </w:r>
+      <w:r>
+        <w:t>-selected features from 216 engineered on-chain and price-derived features.</w:t>
       </w:r>
     </w:p>
     <w:p>
@@ -156,49 +165,66 @@
           <w:b/>
           <w:bCs/>
         </w:rPr>
-        <w:t xml:space="preserve">Backend: </w:t>
-      </w:r>
-      <w:proofErr w:type="spellStart"/>
-      <w:r>
-        <w:t>FastAPI</w:t>
-      </w:r>
-      <w:proofErr w:type="spellEnd"/>
-      <w:r>
-        <w:t xml:space="preserve"> + Python (scikit-learn, </w:t>
-      </w:r>
-      <w:proofErr w:type="spellStart"/>
-      <w:r>
-        <w:t>PyTorch</w:t>
-      </w:r>
-      <w:proofErr w:type="spellEnd"/>
-      <w:r>
-        <w:t xml:space="preserve">, pandas, </w:t>
-      </w:r>
-      <w:proofErr w:type="spellStart"/>
-      <w:r>
-        <w:t>numpy</w:t>
-      </w:r>
-      <w:proofErr w:type="spellEnd"/>
-      <w:r>
-        <w:t>)</w:t>
-      </w:r>
-    </w:p>
-    <w:p>
-      <w:pPr>
-        <w:spacing w:after="80"/>
-      </w:pPr>
+        <w:t>Backend</w:t>
+      </w:r>
       <w:r>
         <w:rPr>
           <w:b/>
           <w:bCs/>
+          <w:highlight w:val="yellow"/>
+        </w:rPr>
+        <w:t xml:space="preserve">: </w:t>
+      </w:r>
+      <w:proofErr w:type="spellStart"/>
+      <w:r>
+        <w:rPr>
+          <w:highlight w:val="yellow"/>
+        </w:rPr>
+        <w:t>FastAPI</w:t>
+      </w:r>
+      <w:proofErr w:type="spellEnd"/>
+      <w:r>
+        <w:t xml:space="preserve"> + Python (scikit-learn, </w:t>
+      </w:r>
+      <w:proofErr w:type="spellStart"/>
+      <w:r>
+        <w:t>PyTorch</w:t>
+      </w:r>
+      <w:proofErr w:type="spellEnd"/>
+      <w:r>
+        <w:t xml:space="preserve">, pandas, </w:t>
+      </w:r>
+      <w:proofErr w:type="spellStart"/>
+      <w:r>
+        <w:t>numpy</w:t>
+      </w:r>
+      <w:proofErr w:type="spellEnd"/>
+      <w:r>
+        <w:t>)</w:t>
+      </w:r>
+    </w:p>
+    <w:p>
+      <w:pPr>
+        <w:spacing w:after="80"/>
+      </w:pPr>
+      <w:r>
+        <w:rPr>
+          <w:b/>
+          <w:bCs/>
         </w:rPr>
         <w:t xml:space="preserve">Frontend: </w:t>
       </w:r>
       <w:r>
+        <w:rPr>
+          <w:highlight w:val="yellow"/>
+        </w:rPr>
         <w:t xml:space="preserve">Next.js 14, React 18, </w:t>
       </w:r>
       <w:proofErr w:type="spellStart"/>
       <w:r>
+        <w:rPr>
+          <w:highlight w:val="yellow"/>
+        </w:rPr>
         <w:t>TailwindCSS</w:t>
       </w:r>
       <w:proofErr w:type="spellEnd"/>
@@ -287,12 +313,6 @@
         <w:gridCol w:w="1391"/>
       </w:tblGrid>
       <w:tr>
-        <w:tblPrEx>
-          <w:tblCellMar>
-            <w:top w:w="0" w:type="dxa"/>
-            <w:bottom w:w="0" w:type="dxa"/>
-          </w:tblCellMar>
-        </w:tblPrEx>
         <w:tc>
           <w:tcPr>
             <w:tcW w:w="2200" w:type="dxa"/>
@@ -445,12 +465,6 @@
         </w:tc>
       </w:tr>
       <w:tr>
-        <w:tblPrEx>
-          <w:tblCellMar>
-            <w:top w:w="0" w:type="dxa"/>
-            <w:bottom w:w="0" w:type="dxa"/>
-          </w:tblCellMar>
-        </w:tblPrEx>
         <w:tc>
           <w:tcPr>
             <w:tcW w:w="2200" w:type="dxa"/>
@@ -585,12 +599,6 @@
         </w:tc>
       </w:tr>
       <w:tr>
-        <w:tblPrEx>
-          <w:tblCellMar>
-            <w:top w:w="0" w:type="dxa"/>
-            <w:bottom w:w="0" w:type="dxa"/>
-          </w:tblCellMar>
-        </w:tblPrEx>
         <w:tc>
           <w:tcPr>
             <w:tcW w:w="2200" w:type="dxa"/>
@@ -739,12 +747,6 @@
         </w:tc>
       </w:tr>
       <w:tr>
-        <w:tblPrEx>
-          <w:tblCellMar>
-            <w:top w:w="0" w:type="dxa"/>
-            <w:bottom w:w="0" w:type="dxa"/>
-          </w:tblCellMar>
-        </w:tblPrEx>
         <w:tc>
           <w:tcPr>
             <w:tcW w:w="2200" w:type="dxa"/>
@@ -886,12 +888,6 @@
         </w:tc>
       </w:tr>
       <w:tr>
-        <w:tblPrEx>
-          <w:tblCellMar>
-            <w:top w:w="0" w:type="dxa"/>
-            <w:bottom w:w="0" w:type="dxa"/>
-          </w:tblCellMar>
-        </w:tblPrEx>
         <w:tc>
           <w:tcPr>
             <w:tcW w:w="2200" w:type="dxa"/>
@@ -1035,12 +1031,6 @@
         </w:tc>
       </w:tr>
       <w:tr>
-        <w:tblPrEx>
-          <w:tblCellMar>
-            <w:top w:w="0" w:type="dxa"/>
-            <w:bottom w:w="0" w:type="dxa"/>
-          </w:tblCellMar>
-        </w:tblPrEx>
         <w:tc>
           <w:tcPr>
             <w:tcW w:w="2200" w:type="dxa"/>
@@ -1184,12 +1174,6 @@
         </w:tc>
       </w:tr>
       <w:tr>
-        <w:tblPrEx>
-          <w:tblCellMar>
-            <w:top w:w="0" w:type="dxa"/>
-            <w:bottom w:w="0" w:type="dxa"/>
-          </w:tblCellMar>
-        </w:tblPrEx>
         <w:tc>
           <w:tcPr>
             <w:tcW w:w="2200" w:type="dxa"/>
@@ -1511,7 +1495,16 @@
         <w:spacing w:after="120"/>
       </w:pPr>
       <w:r>
-        <w:t>The key innovation is rate-of-change feature engineering. Raw on-chain values (e.g., MVRV ratio = 1.3) are weakly predictive by themselves. However, computing the 1-day, 3-day, 7-day, and 14-day percentage changes of each metric creates highly predictive features. For example, a 5% drop in MVRV ratio over 1 day is a strong bearish signal.</w:t>
+        <w:t xml:space="preserve">The key innovation is rate-of-change feature engineering. </w:t>
+      </w:r>
+      <w:r>
+        <w:rPr>
+          <w:highlight w:val="yellow"/>
+        </w:rPr>
+        <w:t>Raw on-chain values (e.g., MVRV ratio = 1.3)</w:t>
+      </w:r>
+      <w:r>
+        <w:t xml:space="preserve"> are weakly predictive by themselves. However, computing the 1-day, 3-day, 7-day, and 14-day percentage changes of each metric creates highly predictive features. For example, a 5% drop in MVRV ratio over 1 day is a strong bearish signal.</w:t>
       </w:r>
     </w:p>
     <w:p>
@@ -1534,22 +1527,40 @@
       </w:r>
       <w:proofErr w:type="spellEnd"/>
       <w:r>
-        <w:t xml:space="preserve"> on-chain endpoints including HODL waves (13 age bands), MVRV ratio, MVRV Z-score, NUPL, NVT ratio, </w:t>
+        <w:t xml:space="preserve"> on-chain endpoints including </w:t>
+      </w:r>
+      <w:r>
+        <w:rPr>
+          <w:highlight w:val="yellow"/>
+        </w:rPr>
+        <w:t xml:space="preserve">HODL waves (13 age bands), MVRV ratio, MVRV Z-score, NUPL, NVT ratio, </w:t>
       </w:r>
       <w:proofErr w:type="spellStart"/>
       <w:r>
+        <w:rPr>
+          <w:highlight w:val="yellow"/>
+        </w:rPr>
         <w:t>Puell</w:t>
       </w:r>
       <w:proofErr w:type="spellEnd"/>
       <w:r>
+        <w:rPr>
+          <w:highlight w:val="yellow"/>
+        </w:rPr>
         <w:t xml:space="preserve"> multiple, reserve risk, exchange </w:t>
       </w:r>
       <w:proofErr w:type="spellStart"/>
       <w:r>
+        <w:rPr>
+          <w:highlight w:val="yellow"/>
+        </w:rPr>
         <w:t>netflow</w:t>
       </w:r>
       <w:proofErr w:type="spellEnd"/>
       <w:r>
+        <w:rPr>
+          <w:highlight w:val="yellow"/>
+        </w:rPr>
         <w:t>/inflow/outflow, supply in profit/loss, adjusted SOPR, CDD, difficulty, hash ribbons, active addresses, liveliness, realized loss.</w:t>
       </w:r>
     </w:p>
@@ -1641,12 +1652,6 @@
         <w:gridCol w:w="4265"/>
       </w:tblGrid>
       <w:tr>
-        <w:tblPrEx>
-          <w:tblCellMar>
-            <w:top w:w="0" w:type="dxa"/>
-            <w:bottom w:w="0" w:type="dxa"/>
-          </w:tblCellMar>
-        </w:tblPrEx>
         <w:tc>
           <w:tcPr>
             <w:tcW w:w="3500" w:type="dxa"/>
@@ -1709,12 +1714,6 @@
         </w:tc>
       </w:tr>
       <w:tr>
-        <w:tblPrEx>
-          <w:tblCellMar>
-            <w:top w:w="0" w:type="dxa"/>
-            <w:bottom w:w="0" w:type="dxa"/>
-          </w:tblCellMar>
-        </w:tblPrEx>
         <w:tc>
           <w:tcPr>
             <w:tcW w:w="3500" w:type="dxa"/>
@@ -1771,12 +1770,6 @@
         </w:tc>
       </w:tr>
       <w:tr>
-        <w:tblPrEx>
-          <w:tblCellMar>
-            <w:top w:w="0" w:type="dxa"/>
-            <w:bottom w:w="0" w:type="dxa"/>
-          </w:tblCellMar>
-        </w:tblPrEx>
         <w:tc>
           <w:tcPr>
             <w:tcW w:w="3500" w:type="dxa"/>
@@ -1833,12 +1826,6 @@
         </w:tc>
       </w:tr>
       <w:tr>
-        <w:tblPrEx>
-          <w:tblCellMar>
-            <w:top w:w="0" w:type="dxa"/>
-            <w:bottom w:w="0" w:type="dxa"/>
-          </w:tblCellMar>
-        </w:tblPrEx>
         <w:tc>
           <w:tcPr>
             <w:tcW w:w="3500" w:type="dxa"/>
@@ -1895,12 +1882,6 @@
         </w:tc>
       </w:tr>
       <w:tr>
-        <w:tblPrEx>
-          <w:tblCellMar>
-            <w:top w:w="0" w:type="dxa"/>
-            <w:bottom w:w="0" w:type="dxa"/>
-          </w:tblCellMar>
-        </w:tblPrEx>
         <w:tc>
           <w:tcPr>
             <w:tcW w:w="3500" w:type="dxa"/>
@@ -1957,12 +1938,6 @@
         </w:tc>
       </w:tr>
       <w:tr>
-        <w:tblPrEx>
-          <w:tblCellMar>
-            <w:top w:w="0" w:type="dxa"/>
-            <w:bottom w:w="0" w:type="dxa"/>
-          </w:tblCellMar>
-        </w:tblPrEx>
         <w:tc>
           <w:tcPr>
             <w:tcW w:w="3500" w:type="dxa"/>
@@ -2019,12 +1994,6 @@
         </w:tc>
       </w:tr>
       <w:tr>
-        <w:tblPrEx>
-          <w:tblCellMar>
-            <w:top w:w="0" w:type="dxa"/>
-            <w:bottom w:w="0" w:type="dxa"/>
-          </w:tblCellMar>
-        </w:tblPrEx>
         <w:tc>
           <w:tcPr>
             <w:tcW w:w="3500" w:type="dxa"/>
@@ -2081,12 +2050,6 @@
         </w:tc>
       </w:tr>
       <w:tr>
-        <w:tblPrEx>
-          <w:tblCellMar>
-            <w:top w:w="0" w:type="dxa"/>
-            <w:bottom w:w="0" w:type="dxa"/>
-          </w:tblCellMar>
-        </w:tblPrEx>
         <w:tc>
           <w:tcPr>
             <w:tcW w:w="3500" w:type="dxa"/>
@@ -2144,12 +2107,6 @@
         </w:tc>
       </w:tr>
       <w:tr>
-        <w:tblPrEx>
-          <w:tblCellMar>
-            <w:top w:w="0" w:type="dxa"/>
-            <w:bottom w:w="0" w:type="dxa"/>
-          </w:tblCellMar>
-        </w:tblPrEx>
         <w:tc>
           <w:tcPr>
             <w:tcW w:w="3500" w:type="dxa"/>
@@ -2206,12 +2163,6 @@
         </w:tc>
       </w:tr>
       <w:tr>
-        <w:tblPrEx>
-          <w:tblCellMar>
-            <w:top w:w="0" w:type="dxa"/>
-            <w:bottom w:w="0" w:type="dxa"/>
-          </w:tblCellMar>
-        </w:tblPrEx>
         <w:tc>
           <w:tcPr>
             <w:tcW w:w="3500" w:type="dxa"/>
@@ -2268,12 +2219,6 @@
         </w:tc>
       </w:tr>
       <w:tr>
-        <w:tblPrEx>
-          <w:tblCellMar>
-            <w:top w:w="0" w:type="dxa"/>
-            <w:bottom w:w="0" w:type="dxa"/>
-          </w:tblCellMar>
-        </w:tblPrEx>
         <w:tc>
           <w:tcPr>
             <w:tcW w:w="3500" w:type="dxa"/>
@@ -2361,12 +2306,6 @@
         <w:gridCol w:w="1548"/>
       </w:tblGrid>
       <w:tr>
-        <w:tblPrEx>
-          <w:tblCellMar>
-            <w:top w:w="0" w:type="dxa"/>
-            <w:bottom w:w="0" w:type="dxa"/>
-          </w:tblCellMar>
-        </w:tblPrEx>
         <w:tc>
           <w:tcPr>
             <w:tcW w:w="3500" w:type="dxa"/>
@@ -2448,12 +2387,6 @@
         </w:tc>
       </w:tr>
       <w:tr>
-        <w:tblPrEx>
-          <w:tblCellMar>
-            <w:top w:w="0" w:type="dxa"/>
-            <w:bottom w:w="0" w:type="dxa"/>
-          </w:tblCellMar>
-        </w:tblPrEx>
         <w:tc>
           <w:tcPr>
             <w:tcW w:w="3500" w:type="dxa"/>
@@ -2537,12 +2470,6 @@
         </w:tc>
       </w:tr>
       <w:tr>
-        <w:tblPrEx>
-          <w:tblCellMar>
-            <w:top w:w="0" w:type="dxa"/>
-            <w:bottom w:w="0" w:type="dxa"/>
-          </w:tblCellMar>
-        </w:tblPrEx>
         <w:tc>
           <w:tcPr>
             <w:tcW w:w="3500" w:type="dxa"/>
@@ -2658,12 +2585,6 @@
         <w:gridCol w:w="1899"/>
       </w:tblGrid>
       <w:tr>
-        <w:tblPrEx>
-          <w:tblCellMar>
-            <w:top w:w="0" w:type="dxa"/>
-            <w:bottom w:w="0" w:type="dxa"/>
-          </w:tblCellMar>
-        </w:tblPrEx>
         <w:tc>
           <w:tcPr>
             <w:tcW w:w="3500" w:type="dxa"/>
@@ -2786,12 +2707,6 @@
         </w:tc>
       </w:tr>
       <w:tr>
-        <w:tblPrEx>
-          <w:tblCellMar>
-            <w:top w:w="0" w:type="dxa"/>
-            <w:bottom w:w="0" w:type="dxa"/>
-          </w:tblCellMar>
-        </w:tblPrEx>
         <w:tc>
           <w:tcPr>
             <w:tcW w:w="3500" w:type="dxa"/>
@@ -2902,12 +2817,6 @@
         </w:tc>
       </w:tr>
       <w:tr>
-        <w:tblPrEx>
-          <w:tblCellMar>
-            <w:top w:w="0" w:type="dxa"/>
-            <w:bottom w:w="0" w:type="dxa"/>
-          </w:tblCellMar>
-        </w:tblPrEx>
         <w:tc>
           <w:tcPr>
             <w:tcW w:w="3500" w:type="dxa"/>
@@ -3028,12 +2937,6 @@
         </w:tc>
       </w:tr>
       <w:tr>
-        <w:tblPrEx>
-          <w:tblCellMar>
-            <w:top w:w="0" w:type="dxa"/>
-            <w:bottom w:w="0" w:type="dxa"/>
-          </w:tblCellMar>
-        </w:tblPrEx>
         <w:tc>
           <w:tcPr>
             <w:tcW w:w="3500" w:type="dxa"/>
@@ -3154,12 +3057,6 @@
         </w:tc>
       </w:tr>
       <w:tr>
-        <w:tblPrEx>
-          <w:tblCellMar>
-            <w:top w:w="0" w:type="dxa"/>
-            <w:bottom w:w="0" w:type="dxa"/>
-          </w:tblCellMar>
-        </w:tblPrEx>
         <w:tc>
           <w:tcPr>
             <w:tcW w:w="3500" w:type="dxa"/>
@@ -3270,12 +3167,6 @@
         </w:tc>
       </w:tr>
       <w:tr>
-        <w:tblPrEx>
-          <w:tblCellMar>
-            <w:top w:w="0" w:type="dxa"/>
-            <w:bottom w:w="0" w:type="dxa"/>
-          </w:tblCellMar>
-        </w:tblPrEx>
         <w:tc>
           <w:tcPr>
             <w:tcW w:w="3500" w:type="dxa"/>
@@ -3386,12 +3277,6 @@
         </w:tc>
       </w:tr>
       <w:tr>
-        <w:tblPrEx>
-          <w:tblCellMar>
-            <w:top w:w="0" w:type="dxa"/>
-            <w:bottom w:w="0" w:type="dxa"/>
-          </w:tblCellMar>
-        </w:tblPrEx>
         <w:tc>
           <w:tcPr>
             <w:tcW w:w="3500" w:type="dxa"/>
@@ -3502,12 +3387,6 @@
         </w:tc>
       </w:tr>
       <w:tr>
-        <w:tblPrEx>
-          <w:tblCellMar>
-            <w:top w:w="0" w:type="dxa"/>
-            <w:bottom w:w="0" w:type="dxa"/>
-          </w:tblCellMar>
-        </w:tblPrEx>
         <w:tc>
           <w:tcPr>
             <w:tcW w:w="3500" w:type="dxa"/>
@@ -3620,12 +3499,6 @@
         </w:tc>
       </w:tr>
       <w:tr>
-        <w:tblPrEx>
-          <w:tblCellMar>
-            <w:top w:w="0" w:type="dxa"/>
-            <w:bottom w:w="0" w:type="dxa"/>
-          </w:tblCellMar>
-        </w:tblPrEx>
         <w:tc>
           <w:tcPr>
             <w:tcW w:w="3500" w:type="dxa"/>
@@ -3736,12 +3609,6 @@
         </w:tc>
       </w:tr>
       <w:tr>
-        <w:tblPrEx>
-          <w:tblCellMar>
-            <w:top w:w="0" w:type="dxa"/>
-            <w:bottom w:w="0" w:type="dxa"/>
-          </w:tblCellMar>
-        </w:tblPrEx>
         <w:tc>
           <w:tcPr>
             <w:tcW w:w="3500" w:type="dxa"/>
@@ -3852,12 +3719,6 @@
         </w:tc>
       </w:tr>
       <w:tr>
-        <w:tblPrEx>
-          <w:tblCellMar>
-            <w:top w:w="0" w:type="dxa"/>
-            <w:bottom w:w="0" w:type="dxa"/>
-          </w:tblCellMar>
-        </w:tblPrEx>
         <w:tc>
           <w:tcPr>
             <w:tcW w:w="3500" w:type="dxa"/>
@@ -4006,12 +3867,6 @@
         <w:gridCol w:w="1794"/>
       </w:tblGrid>
       <w:tr>
-        <w:tblPrEx>
-          <w:tblCellMar>
-            <w:top w:w="0" w:type="dxa"/>
-            <w:bottom w:w="0" w:type="dxa"/>
-          </w:tblCellMar>
-        </w:tblPrEx>
         <w:tc>
           <w:tcPr>
             <w:tcW w:w="3500" w:type="dxa"/>
@@ -4134,12 +3989,6 @@
         </w:tc>
       </w:tr>
       <w:tr>
-        <w:tblPrEx>
-          <w:tblCellMar>
-            <w:top w:w="0" w:type="dxa"/>
-            <w:bottom w:w="0" w:type="dxa"/>
-          </w:tblCellMar>
-        </w:tblPrEx>
         <w:tc>
           <w:tcPr>
             <w:tcW w:w="3500" w:type="dxa"/>
@@ -4252,12 +4101,6 @@
         </w:tc>
       </w:tr>
       <w:tr>
-        <w:tblPrEx>
-          <w:tblCellMar>
-            <w:top w:w="0" w:type="dxa"/>
-            <w:bottom w:w="0" w:type="dxa"/>
-          </w:tblCellMar>
-        </w:tblPrEx>
         <w:tc>
           <w:tcPr>
             <w:tcW w:w="3500" w:type="dxa"/>
@@ -4386,12 +4229,6 @@
         </w:tc>
       </w:tr>
       <w:tr>
-        <w:tblPrEx>
-          <w:tblCellMar>
-            <w:top w:w="0" w:type="dxa"/>
-            <w:bottom w:w="0" w:type="dxa"/>
-          </w:tblCellMar>
-        </w:tblPrEx>
         <w:tc>
           <w:tcPr>
             <w:tcW w:w="3500" w:type="dxa"/>
@@ -4502,12 +4339,6 @@
         </w:tc>
       </w:tr>
       <w:tr>
-        <w:tblPrEx>
-          <w:tblCellMar>
-            <w:top w:w="0" w:type="dxa"/>
-            <w:bottom w:w="0" w:type="dxa"/>
-          </w:tblCellMar>
-        </w:tblPrEx>
         <w:tc>
           <w:tcPr>
             <w:tcW w:w="3500" w:type="dxa"/>
@@ -4620,12 +4451,6 @@
         </w:tc>
       </w:tr>
       <w:tr>
-        <w:tblPrEx>
-          <w:tblCellMar>
-            <w:top w:w="0" w:type="dxa"/>
-            <w:bottom w:w="0" w:type="dxa"/>
-          </w:tblCellMar>
-        </w:tblPrEx>
         <w:tc>
           <w:tcPr>
             <w:tcW w:w="3500" w:type="dxa"/>
@@ -4748,12 +4573,6 @@
         </w:tc>
       </w:tr>
       <w:tr>
-        <w:tblPrEx>
-          <w:tblCellMar>
-            <w:top w:w="0" w:type="dxa"/>
-            <w:bottom w:w="0" w:type="dxa"/>
-          </w:tblCellMar>
-        </w:tblPrEx>
         <w:tc>
           <w:tcPr>
             <w:tcW w:w="3500" w:type="dxa"/>
@@ -4874,12 +4693,6 @@
         </w:tc>
       </w:tr>
       <w:tr>
-        <w:tblPrEx>
-          <w:tblCellMar>
-            <w:top w:w="0" w:type="dxa"/>
-            <w:bottom w:w="0" w:type="dxa"/>
-          </w:tblCellMar>
-        </w:tblPrEx>
         <w:tc>
           <w:tcPr>
             <w:tcW w:w="3500" w:type="dxa"/>

</xml_diff>